<commit_message>
Add bulk image upload script and update storage policies
- Created a PowerShell script for bulk uploading images to Supabase storage, handling various image types and encoding them in base64.
- Implemented new storage policies to allow authenticated users to upload, update, and delete their own location images in the 'location-images' bucket.
- Migrated existing image paths in the 'public.locations' table to the new public folder structure for three locations: Belmeken, Polejan, and Sinanica.
</commit_message>
<xml_diff>
--- a/PrompsMap.docx
+++ b/PrompsMap.docx
@@ -48,7 +48,15 @@
         <w:t xml:space="preserve">-When insert location user should be possibility to add short information about locations and add pictures if hi want. </w:t>
       </w:r>
       <w:r>
-        <w:t>This mean to create necessary buckets</w:t>
+        <w:t xml:space="preserve">This </w:t>
+      </w:r>
+      <w:proofErr w:type="gramStart"/>
+      <w:r>
+        <w:t>mean</w:t>
+      </w:r>
+      <w:proofErr w:type="gramEnd"/>
+      <w:r>
+        <w:t xml:space="preserve"> to create necessary buckets</w:t>
       </w:r>
     </w:p>
     <w:p>
@@ -76,7 +84,15 @@
     </w:p>
     <w:p>
       <w:r>
-        <w:t>-Define RLS policies to protect users data</w:t>
+        <w:t xml:space="preserve">-Define RLS policies to protect </w:t>
+      </w:r>
+      <w:proofErr w:type="gramStart"/>
+      <w:r>
+        <w:t>users</w:t>
+      </w:r>
+      <w:proofErr w:type="gramEnd"/>
+      <w:r>
+        <w:t xml:space="preserve"> data</w:t>
       </w:r>
     </w:p>
     <w:p>
@@ -1244,15 +1260,31 @@
           <w:b/>
           <w:bCs/>
         </w:rPr>
-        <w:t>is_admin</w:t>
-      </w:r>
-      <w:proofErr w:type="spellEnd"/>
-      <w:r>
-        <w:rPr>
-          <w:b/>
-          <w:bCs/>
-        </w:rPr>
-        <w:t>()</w:t>
+        <w:t>is_</w:t>
+      </w:r>
+      <w:proofErr w:type="gramStart"/>
+      <w:r>
+        <w:rPr>
+          <w:b/>
+          <w:bCs/>
+        </w:rPr>
+        <w:t>admin</w:t>
+      </w:r>
+      <w:proofErr w:type="spellEnd"/>
+      <w:r>
+        <w:rPr>
+          <w:b/>
+          <w:bCs/>
+        </w:rPr>
+        <w:t>(</w:t>
+      </w:r>
+      <w:proofErr w:type="gramEnd"/>
+      <w:r>
+        <w:rPr>
+          <w:b/>
+          <w:bCs/>
+        </w:rPr>
+        <w:t>)</w:t>
       </w:r>
     </w:p>
     <w:p>
@@ -1851,6 +1883,34 @@
           <w:bCs/>
         </w:rPr>
       </w:pPr>
+      <w:r>
+        <w:rPr>
+          <w:b/>
+          <w:bCs/>
+        </w:rPr>
+        <w:t>multi</w:t>
+      </w:r>
+      <w:r>
+        <w:rPr>
+          <w:b/>
+          <w:bCs/>
+        </w:rPr>
+        <w:t xml:space="preserve"> </w:t>
+      </w:r>
+      <w:r>
+        <w:rPr>
+          <w:b/>
+          <w:bCs/>
+        </w:rPr>
+        <w:t xml:space="preserve"> </w:t>
+      </w:r>
+      <w:r>
+        <w:rPr>
+          <w:b/>
+          <w:bCs/>
+        </w:rPr>
+        <w:t xml:space="preserve"> chose</w:t>
+      </w:r>
     </w:p>
     <w:p>
       <w:pPr>

</xml_diff>

<commit_message>
Add images from Botev event and update elevation handling in map search
</commit_message>
<xml_diff>
--- a/PrompsMap.docx
+++ b/PrompsMap.docx
@@ -1873,6 +1873,7 @@
         <w:rPr>
           <w:b/>
           <w:bCs/>
+          <w:lang w:val="bg-BG"/>
         </w:rPr>
       </w:pPr>
     </w:p>
@@ -2122,6 +2123,163 @@
         </w:rPr>
         <w:t xml:space="preserve"> съобщения?</w:t>
       </w:r>
+    </w:p>
+    <w:p>
+      <w:pPr>
+        <w:rPr>
+          <w:b/>
+          <w:bCs/>
+          <w:lang w:val="bg-BG"/>
+        </w:rPr>
+      </w:pPr>
+      <w:r>
+        <w:rPr>
+          <w:b/>
+          <w:bCs/>
+          <w:lang w:val="bg-BG"/>
+        </w:rPr>
+        <w:t xml:space="preserve">- Искам при </w:t>
+      </w:r>
+      <w:r>
+        <w:rPr>
+          <w:b/>
+          <w:bCs/>
+          <w:lang w:val="bg-BG"/>
+        </w:rPr>
+        <w:t>създаването</w:t>
+      </w:r>
+      <w:r>
+        <w:rPr>
+          <w:b/>
+          <w:bCs/>
+          <w:lang w:val="bg-BG"/>
+        </w:rPr>
+        <w:t xml:space="preserve"> на нова локация да се прави автоматично папка в </w:t>
+      </w:r>
+      <w:proofErr w:type="spellStart"/>
+      <w:r>
+        <w:rPr>
+          <w:b/>
+          <w:bCs/>
+          <w:lang w:val="bg-BG"/>
+        </w:rPr>
+        <w:t>buckets</w:t>
+      </w:r>
+      <w:proofErr w:type="spellEnd"/>
+      <w:r>
+        <w:rPr>
+          <w:b/>
+          <w:bCs/>
+          <w:lang w:val="bg-BG"/>
+        </w:rPr>
+        <w:t xml:space="preserve"> </w:t>
+      </w:r>
+      <w:proofErr w:type="spellStart"/>
+      <w:r>
+        <w:rPr>
+          <w:b/>
+          <w:bCs/>
+          <w:lang w:val="bg-BG"/>
+        </w:rPr>
+        <w:t>public</w:t>
+      </w:r>
+      <w:proofErr w:type="spellEnd"/>
+      <w:r>
+        <w:rPr>
+          <w:b/>
+          <w:bCs/>
+          <w:lang w:val="bg-BG"/>
+        </w:rPr>
+        <w:t xml:space="preserve"> като наименованието на папката да е името на локацията на латинеца плюс д</w:t>
+      </w:r>
+      <w:r>
+        <w:rPr>
+          <w:b/>
+          <w:bCs/>
+          <w:lang w:val="bg-BG"/>
+        </w:rPr>
+        <w:t>а</w:t>
+      </w:r>
+      <w:r>
+        <w:rPr>
+          <w:b/>
+          <w:bCs/>
+          <w:lang w:val="bg-BG"/>
+        </w:rPr>
+        <w:t>тата на събитието в подобен формат "</w:t>
+      </w:r>
+      <w:proofErr w:type="spellStart"/>
+      <w:r>
+        <w:rPr>
+          <w:b/>
+          <w:bCs/>
+          <w:lang w:val="bg-BG"/>
+        </w:rPr>
+        <w:t>location</w:t>
+      </w:r>
+      <w:proofErr w:type="spellEnd"/>
+      <w:r>
+        <w:rPr>
+          <w:b/>
+          <w:bCs/>
+          <w:lang w:val="bg-BG"/>
+        </w:rPr>
+        <w:t xml:space="preserve"> </w:t>
+      </w:r>
+      <w:proofErr w:type="spellStart"/>
+      <w:r>
+        <w:rPr>
+          <w:b/>
+          <w:bCs/>
+          <w:lang w:val="bg-BG"/>
+        </w:rPr>
+        <w:t>dd.mm.yyyy</w:t>
+      </w:r>
+      <w:proofErr w:type="spellEnd"/>
+      <w:r>
+        <w:rPr>
+          <w:b/>
+          <w:bCs/>
+          <w:lang w:val="bg-BG"/>
+        </w:rPr>
+        <w:t xml:space="preserve">" като за </w:t>
+      </w:r>
+      <w:proofErr w:type="spellStart"/>
+      <w:r>
+        <w:rPr>
+          <w:b/>
+          <w:bCs/>
+          <w:lang w:val="bg-BG"/>
+        </w:rPr>
+        <w:t>location</w:t>
+      </w:r>
+      <w:proofErr w:type="spellEnd"/>
+      <w:r>
+        <w:rPr>
+          <w:b/>
+          <w:bCs/>
+          <w:lang w:val="bg-BG"/>
+        </w:rPr>
+        <w:t xml:space="preserve"> вземаш името на локацията на латинеца започващо с главна буква а датата ще вземаш от полето за дата.</w:t>
+      </w:r>
+    </w:p>
+    <w:p>
+      <w:pPr>
+        <w:rPr>
+          <w:b/>
+          <w:bCs/>
+          <w:lang w:val="bg-BG"/>
+        </w:rPr>
+      </w:pPr>
+    </w:p>
+    <w:p>
+      <w:pPr>
+        <w:rPr>
+          <w:b/>
+          <w:bCs/>
+          <w:lang w:val="bg-BG"/>
+        </w:rPr>
+      </w:pPr>
     </w:p>
     <w:sectPr>
       <w:pgSz w:w="12240" w:h="15840"/>

</xml_diff>

<commit_message>
Change stile in mobile and desktop version in app
</commit_message>
<xml_diff>
--- a/PrompsMap.docx
+++ b/PrompsMap.docx
@@ -14,15 +14,7 @@
     </w:p>
     <w:p>
       <w:r>
-        <w:t xml:space="preserve">-Use </w:t>
-      </w:r>
-      <w:proofErr w:type="spellStart"/>
-      <w:r>
-        <w:t>Supabaseas</w:t>
-      </w:r>
-      <w:proofErr w:type="spellEnd"/>
-      <w:r>
-        <w:t xml:space="preserve"> backend to store users and locations</w:t>
+        <w:t>-Use Supabaseas backend to store users and locations</w:t>
       </w:r>
     </w:p>
     <w:p>
@@ -48,15 +40,7 @@
         <w:t xml:space="preserve">-When insert location user should be possibility to add short information about locations and add pictures if hi want. </w:t>
       </w:r>
       <w:r>
-        <w:t xml:space="preserve">This </w:t>
-      </w:r>
-      <w:proofErr w:type="gramStart"/>
-      <w:r>
-        <w:t>mean</w:t>
-      </w:r>
-      <w:proofErr w:type="gramEnd"/>
-      <w:r>
-        <w:t xml:space="preserve"> to create necessary buckets</w:t>
+        <w:t>This mean to create necessary buckets</w:t>
       </w:r>
     </w:p>
     <w:p>
@@ -66,15 +50,7 @@
     </w:p>
     <w:p>
       <w:r>
-        <w:t xml:space="preserve">-Use the </w:t>
-      </w:r>
-      <w:proofErr w:type="spellStart"/>
-      <w:r>
-        <w:t>Supabase</w:t>
-      </w:r>
-      <w:proofErr w:type="spellEnd"/>
-      <w:r>
-        <w:t xml:space="preserve"> MCP to access the DB directly</w:t>
+        <w:t>-Use the Supabase MCP to access the DB directly</w:t>
       </w:r>
     </w:p>
     <w:p>
@@ -84,15 +60,7 @@
     </w:p>
     <w:p>
       <w:r>
-        <w:t xml:space="preserve">-Define RLS policies to protect </w:t>
-      </w:r>
-      <w:proofErr w:type="gramStart"/>
-      <w:r>
-        <w:t>users</w:t>
-      </w:r>
-      <w:proofErr w:type="gramEnd"/>
-      <w:r>
-        <w:t xml:space="preserve"> data</w:t>
+        <w:t>-Define RLS policies to protect users data</w:t>
       </w:r>
     </w:p>
     <w:p>
@@ -203,13 +171,8 @@
           <w:lang w:val="bg-BG"/>
         </w:rPr>
       </w:pPr>
-      <w:proofErr w:type="spellStart"/>
-      <w:r>
-        <w:t>Добави</w:t>
-      </w:r>
-      <w:proofErr w:type="spellEnd"/>
-      <w:r>
-        <w:t xml:space="preserve"> </w:t>
+      <w:r>
+        <w:t xml:space="preserve">Добави </w:t>
       </w:r>
       <w:r>
         <w:rPr>
@@ -247,50 +210,40 @@
         </w:rPr>
         <w:t xml:space="preserve"> </w:t>
       </w:r>
-      <w:proofErr w:type="spellStart"/>
-      <w:r>
-        <w:t>връх</w:t>
-      </w:r>
-      <w:proofErr w:type="spellEnd"/>
-      <w:r>
+      <w:r>
+        <w:t>връх Полежан</w:t>
+      </w:r>
+      <w:r>
+        <w:rPr>
+          <w:lang w:val="bg-BG"/>
+        </w:rPr>
+        <w:t>, Пирин</w:t>
+      </w:r>
+    </w:p>
+    <w:p>
+      <w:r>
+        <w:rPr>
+          <w:b/>
+          <w:bCs/>
+          <w:lang w:val="bg-BG"/>
+        </w:rPr>
+        <w:t>Дата:</w:t>
+      </w:r>
+      <w:r>
+        <w:rPr>
+          <w:lang w:val="bg-BG"/>
+        </w:rPr>
         <w:t xml:space="preserve"> </w:t>
       </w:r>
-      <w:proofErr w:type="spellStart"/>
-      <w:r>
-        <w:t>Полежан</w:t>
-      </w:r>
-      <w:proofErr w:type="spellEnd"/>
-      <w:r>
-        <w:rPr>
-          <w:lang w:val="bg-BG"/>
-        </w:rPr>
-        <w:t>, Пирин</w:t>
-      </w:r>
-    </w:p>
-    <w:p>
-      <w:r>
-        <w:rPr>
-          <w:b/>
-          <w:bCs/>
-          <w:lang w:val="bg-BG"/>
-        </w:rPr>
-        <w:t>Дата:</w:t>
-      </w:r>
-      <w:r>
-        <w:rPr>
-          <w:lang w:val="bg-BG"/>
-        </w:rPr>
+      <w:r>
+        <w:rPr>
+          <w:lang w:val="bg-BG"/>
+        </w:rPr>
+        <w:t>17 август 2024</w:t>
+      </w:r>
+      <w:r>
         <w:t xml:space="preserve"> </w:t>
       </w:r>
-      <w:r>
-        <w:rPr>
-          <w:lang w:val="bg-BG"/>
-        </w:rPr>
-        <w:t>17 август 2024</w:t>
-      </w:r>
-      <w:r>
-        <w:t xml:space="preserve"> </w:t>
-      </w:r>
     </w:p>
     <w:p>
       <w:pPr>
@@ -310,849 +263,494 @@
         </w:rPr>
         <w:t xml:space="preserve">: </w:t>
       </w:r>
-      <w:proofErr w:type="spellStart"/>
       <w:r>
         <w:rPr>
           <w:rStyle w:val="Strong"/>
           <w:rFonts w:eastAsiaTheme="majorEastAsia"/>
         </w:rPr>
-        <w:t>Връх</w:t>
-      </w:r>
-      <w:proofErr w:type="spellEnd"/>
-      <w:r>
-        <w:rPr>
-          <w:rStyle w:val="Strong"/>
-          <w:rFonts w:eastAsiaTheme="majorEastAsia"/>
+        <w:t>Връх Полежан</w:t>
+      </w:r>
+      <w:r>
+        <w:t xml:space="preserve"> (2851 м) е третият по височина връх в Пирин планина след Вихрен и Кутело. Намира се в северната част на планината, издигайки се над Попово езеро и циркуса на Десилица.</w:t>
+      </w:r>
+    </w:p>
+    <w:p>
+      <w:pPr>
+        <w:pStyle w:val="NormalWeb"/>
+      </w:pPr>
+      <w:r>
+        <w:t>Характеризира се с широки, сравнително полегати склонове (откъдето идва и името му), което го прави по-достъпен за изкачване в сравнение с Вихрен. От върха се разкрива впечатляваща панорама към мраморния дял на Пирин, Кончето и множество ледникови езера.</w:t>
+      </w:r>
+    </w:p>
+    <w:p>
+      <w:pPr>
+        <w:pStyle w:val="NormalWeb"/>
+      </w:pPr>
+      <w:r>
+        <w:t>Полежан е предпочитана цел както през лятото за планински туризъм, така и през зимата за ски-алпинизъм.</w:t>
+      </w:r>
+    </w:p>
+    <w:p>
+      <w:pPr>
+        <w:rPr>
+          <w:b/>
+          <w:bCs/>
+          <w:lang w:val="bg-BG"/>
+        </w:rPr>
+      </w:pPr>
+      <w:r>
+        <w:rPr>
+          <w:b/>
+          <w:bCs/>
+          <w:lang w:val="bg-BG"/>
+        </w:rPr>
+        <w:t xml:space="preserve">Сезон: </w:t>
+      </w:r>
+      <w:r>
+        <w:rPr>
+          <w:b/>
+          <w:bCs/>
+          <w:lang w:val="bg-BG"/>
+        </w:rPr>
+        <w:t>Сезон: 2024</w:t>
+      </w:r>
+    </w:p>
+    <w:p>
+      <w:pPr>
+        <w:rPr>
+          <w:b/>
+          <w:bCs/>
+        </w:rPr>
+      </w:pPr>
+      <w:r>
+        <w:rPr>
+          <w:b/>
+          <w:bCs/>
+          <w:lang w:val="bg-BG"/>
+        </w:rPr>
+        <w:t xml:space="preserve">Снимки: </w:t>
+      </w:r>
+      <w:r>
+        <w:rPr>
+          <w:b/>
+          <w:bCs/>
+        </w:rPr>
+        <w:t>Images\Polejan 17.08.2024</w:t>
+      </w:r>
+    </w:p>
+    <w:p>
+      <w:pPr>
+        <w:rPr>
+          <w:b/>
+          <w:bCs/>
+          <w:lang w:val="bg-BG"/>
+        </w:rPr>
+      </w:pPr>
+      <w:r>
+        <w:rPr>
+          <w:b/>
+          <w:bCs/>
+          <w:lang w:val="bg-BG"/>
+        </w:rPr>
+        <w:t>Намери координатите и ги добави автоматичн</w:t>
+      </w:r>
+      <w:r>
+        <w:rPr>
+          <w:b/>
+          <w:bCs/>
+          <w:lang w:val="bg-BG"/>
+        </w:rPr>
+        <w:t>о</w:t>
+      </w:r>
+    </w:p>
+    <w:p>
+      <w:pPr>
+        <w:rPr>
+          <w:b/>
+          <w:bCs/>
+        </w:rPr>
+      </w:pPr>
+      <w:r>
+        <w:rPr>
+          <w:b/>
+          <w:bCs/>
+        </w:rPr>
+        <w:t>Step 4</w:t>
+      </w:r>
+    </w:p>
+    <w:p>
+      <w:pPr>
+        <w:rPr>
+          <w:b/>
+          <w:bCs/>
+        </w:rPr>
+      </w:pPr>
+      <w:r>
+        <w:rPr>
+          <w:b/>
+          <w:bCs/>
+        </w:rPr>
+        <w:t>Implement user roles in Supabase:</w:t>
+      </w:r>
+    </w:p>
+    <w:p>
+      <w:pPr>
+        <w:rPr>
+          <w:b/>
+          <w:bCs/>
+        </w:rPr>
+      </w:pPr>
+      <w:r>
+        <w:rPr>
+          <w:b/>
+          <w:bCs/>
+        </w:rPr>
+        <w:t>-Enum: app_role (</w:t>
+      </w:r>
+      <w:r>
+        <w:rPr>
+          <w:b/>
+          <w:bCs/>
+        </w:rPr>
+        <w:t>visitors</w:t>
+      </w:r>
+      <w:r>
+        <w:rPr>
+          <w:b/>
+          <w:bCs/>
+        </w:rPr>
+        <w:t xml:space="preserve"> | </w:t>
+      </w:r>
+      <w:r>
+        <w:rPr>
+          <w:b/>
+          <w:bCs/>
+        </w:rPr>
+        <w:t>publisher</w:t>
+      </w:r>
+      <w:r>
+        <w:rPr>
+          <w:b/>
+          <w:bCs/>
         </w:rPr>
         <w:t xml:space="preserve"> </w:t>
       </w:r>
-      <w:proofErr w:type="spellStart"/>
-      <w:r>
-        <w:rPr>
-          <w:rStyle w:val="Strong"/>
-          <w:rFonts w:eastAsiaTheme="majorEastAsia"/>
-        </w:rPr>
-        <w:t>Полежан</w:t>
-      </w:r>
-      <w:proofErr w:type="spellEnd"/>
-      <w:r>
-        <w:t xml:space="preserve"> (2851 м) е </w:t>
-      </w:r>
-      <w:proofErr w:type="spellStart"/>
-      <w:r>
-        <w:t>третият</w:t>
-      </w:r>
-      <w:proofErr w:type="spellEnd"/>
-      <w:r>
+      <w:r>
+        <w:rPr>
+          <w:b/>
+          <w:bCs/>
+        </w:rPr>
+        <w:t xml:space="preserve">| </w:t>
+      </w:r>
+      <w:r>
+        <w:rPr>
+          <w:b/>
+          <w:bCs/>
+        </w:rPr>
+        <w:t>editor</w:t>
+      </w:r>
+      <w:r>
+        <w:rPr>
+          <w:b/>
+          <w:bCs/>
+        </w:rPr>
         <w:t xml:space="preserve"> </w:t>
       </w:r>
-      <w:proofErr w:type="spellStart"/>
-      <w:r>
-        <w:t>по</w:t>
-      </w:r>
-      <w:proofErr w:type="spellEnd"/>
-      <w:r>
+      <w:r>
+        <w:rPr>
+          <w:b/>
+          <w:bCs/>
+        </w:rPr>
+        <w:t>|</w:t>
+      </w:r>
+      <w:r>
+        <w:rPr>
+          <w:b/>
+          <w:bCs/>
+        </w:rPr>
+        <w:t>admin)</w:t>
+      </w:r>
+    </w:p>
+    <w:p>
+      <w:pPr>
+        <w:rPr>
+          <w:b/>
+          <w:bCs/>
+        </w:rPr>
+      </w:pPr>
+      <w:r>
+        <w:rPr>
+          <w:b/>
+          <w:bCs/>
+        </w:rPr>
+        <w:t>-Тable: user_roles (user_id, user_role)</w:t>
+      </w:r>
+    </w:p>
+    <w:p>
+      <w:pPr>
+        <w:rPr>
+          <w:b/>
+          <w:bCs/>
+        </w:rPr>
+      </w:pPr>
+      <w:r>
+        <w:rPr>
+          <w:b/>
+          <w:bCs/>
+        </w:rPr>
+        <w:t>Define RLS policies:</w:t>
+      </w:r>
+    </w:p>
+    <w:p>
+      <w:pPr>
+        <w:rPr>
+          <w:b/>
+          <w:bCs/>
+        </w:rPr>
+      </w:pPr>
+      <w:r>
+        <w:rPr>
+          <w:b/>
+          <w:bCs/>
+        </w:rPr>
+        <w:t>-Everyone can read user_roles</w:t>
+      </w:r>
+    </w:p>
+    <w:p>
+      <w:pPr>
+        <w:rPr>
+          <w:b/>
+          <w:bCs/>
+        </w:rPr>
+      </w:pPr>
+      <w:r>
+        <w:rPr>
+          <w:b/>
+          <w:bCs/>
+        </w:rPr>
+        <w:t>-Database function is_admin()</w:t>
+      </w:r>
+    </w:p>
+    <w:p>
+      <w:pPr>
+        <w:rPr>
+          <w:b/>
+          <w:bCs/>
+        </w:rPr>
+      </w:pPr>
+      <w:r>
+        <w:rPr>
+          <w:b/>
+          <w:bCs/>
+        </w:rPr>
+        <w:t xml:space="preserve">-Everyone </w:t>
+      </w:r>
+      <w:r>
+        <w:rPr>
+          <w:b/>
+          <w:bCs/>
+        </w:rPr>
+        <w:t xml:space="preserve">can </w:t>
+      </w:r>
+      <w:r>
+        <w:rPr>
+          <w:b/>
+          <w:bCs/>
+        </w:rPr>
+        <w:t xml:space="preserve">only </w:t>
+      </w:r>
+      <w:r>
+        <w:rPr>
+          <w:b/>
+          <w:bCs/>
+        </w:rPr>
+        <w:t>r</w:t>
+      </w:r>
+      <w:r>
+        <w:rPr>
+          <w:b/>
+          <w:bCs/>
+        </w:rPr>
+        <w:t>ead</w:t>
+      </w:r>
+      <w:r>
+        <w:rPr>
+          <w:b/>
+          <w:bCs/>
+        </w:rPr>
         <w:t xml:space="preserve"> </w:t>
       </w:r>
-      <w:proofErr w:type="spellStart"/>
-      <w:r>
-        <w:t>височина</w:t>
-      </w:r>
-      <w:proofErr w:type="spellEnd"/>
-      <w:r>
+      <w:r>
+        <w:rPr>
+          <w:b/>
+          <w:bCs/>
+        </w:rPr>
+        <w:t xml:space="preserve">location </w:t>
+      </w:r>
+      <w:r>
+        <w:rPr>
+          <w:b/>
+          <w:bCs/>
+        </w:rPr>
+        <w:t>information in app</w:t>
+      </w:r>
+    </w:p>
+    <w:p>
+      <w:pPr>
+        <w:rPr>
+          <w:b/>
+          <w:bCs/>
+        </w:rPr>
+      </w:pPr>
+      <w:r>
+        <w:rPr>
+          <w:b/>
+          <w:bCs/>
+        </w:rPr>
+        <w:t>-</w:t>
+      </w:r>
+      <w:r>
+        <w:rPr>
+          <w:b/>
+          <w:bCs/>
+        </w:rPr>
+        <w:t>Publisher</w:t>
+      </w:r>
+      <w:r>
+        <w:rPr>
+          <w:b/>
+          <w:bCs/>
+        </w:rPr>
+        <w:t xml:space="preserve"> can rea</w:t>
+      </w:r>
+      <w:r>
+        <w:rPr>
+          <w:b/>
+          <w:bCs/>
+        </w:rPr>
+        <w:t xml:space="preserve">d </w:t>
+      </w:r>
+      <w:r>
+        <w:rPr>
+          <w:b/>
+          <w:bCs/>
+        </w:rPr>
+        <w:t>information in app</w:t>
+      </w:r>
+      <w:r>
+        <w:rPr>
+          <w:b/>
+          <w:bCs/>
+        </w:rPr>
+        <w:t xml:space="preserve"> and change only location </w:t>
+      </w:r>
+      <w:r>
+        <w:rPr>
+          <w:b/>
+          <w:bCs/>
+        </w:rPr>
+        <w:t>that is own</w:t>
+      </w:r>
+    </w:p>
+    <w:p>
+      <w:pPr>
+        <w:rPr>
+          <w:b/>
+          <w:bCs/>
+        </w:rPr>
+      </w:pPr>
+      <w:r>
+        <w:rPr>
+          <w:b/>
+          <w:bCs/>
+        </w:rPr>
+        <w:t>-</w:t>
+      </w:r>
+      <w:r>
+        <w:rPr>
+          <w:b/>
+          <w:bCs/>
+        </w:rPr>
         <w:t xml:space="preserve"> </w:t>
       </w:r>
-      <w:proofErr w:type="spellStart"/>
-      <w:r>
-        <w:t>връх</w:t>
-      </w:r>
-      <w:proofErr w:type="spellEnd"/>
-      <w:r>
-        <w:t xml:space="preserve"> в </w:t>
-      </w:r>
-      <w:proofErr w:type="spellStart"/>
-      <w:r>
-        <w:t>Пирин</w:t>
-      </w:r>
-      <w:proofErr w:type="spellEnd"/>
-      <w:r>
+      <w:r>
+        <w:rPr>
+          <w:b/>
+          <w:bCs/>
+        </w:rPr>
+        <w:t xml:space="preserve">Editor can read </w:t>
+      </w:r>
+      <w:r>
+        <w:rPr>
+          <w:b/>
+          <w:bCs/>
+        </w:rPr>
+        <w:t>everting</w:t>
+      </w:r>
+      <w:r>
+        <w:rPr>
+          <w:b/>
+          <w:bCs/>
+        </w:rPr>
+        <w:t xml:space="preserve"> and edit </w:t>
+      </w:r>
+      <w:r>
+        <w:rPr>
+          <w:b/>
+          <w:bCs/>
+        </w:rPr>
+        <w:t xml:space="preserve">everything information in the </w:t>
+      </w:r>
+      <w:r>
+        <w:rPr>
+          <w:b/>
+          <w:bCs/>
+        </w:rPr>
+        <w:t>location</w:t>
+      </w:r>
+      <w:r>
+        <w:rPr>
+          <w:b/>
+          <w:bCs/>
+        </w:rPr>
         <w:t xml:space="preserve"> </w:t>
       </w:r>
-      <w:proofErr w:type="spellStart"/>
-      <w:r>
-        <w:t>планина</w:t>
-      </w:r>
-      <w:proofErr w:type="spellEnd"/>
-      <w:r>
+    </w:p>
+    <w:p>
+      <w:pPr>
+        <w:rPr>
+          <w:b/>
+          <w:bCs/>
+        </w:rPr>
+      </w:pPr>
+      <w:r>
+        <w:rPr>
+          <w:b/>
+          <w:bCs/>
+        </w:rPr>
+        <w:t>-Only admins</w:t>
+      </w:r>
+      <w:r>
+        <w:rPr>
+          <w:b/>
+          <w:bCs/>
+        </w:rPr>
         <w:t xml:space="preserve"> </w:t>
       </w:r>
-      <w:proofErr w:type="spellStart"/>
-      <w:r>
-        <w:t>след</w:t>
-      </w:r>
-      <w:proofErr w:type="spellEnd"/>
-      <w:r>
+      <w:r>
+        <w:rPr>
+          <w:b/>
+          <w:bCs/>
+        </w:rPr>
+        <w:t>can write</w:t>
+      </w:r>
+      <w:r>
+        <w:rPr>
+          <w:b/>
+          <w:bCs/>
+        </w:rPr>
         <w:t xml:space="preserve"> </w:t>
       </w:r>
-      <w:proofErr w:type="spellStart"/>
-      <w:r>
-        <w:t>Вихрен</w:t>
-      </w:r>
-      <w:proofErr w:type="spellEnd"/>
-      <w:r>
-        <w:t xml:space="preserve"> и </w:t>
-      </w:r>
-      <w:proofErr w:type="spellStart"/>
-      <w:r>
-        <w:t>Кутело</w:t>
-      </w:r>
-      <w:proofErr w:type="spellEnd"/>
-      <w:r>
-        <w:t xml:space="preserve">. </w:t>
-      </w:r>
-      <w:proofErr w:type="spellStart"/>
-      <w:r>
-        <w:t>Намира</w:t>
-      </w:r>
-      <w:proofErr w:type="spellEnd"/>
-      <w:r>
-        <w:t xml:space="preserve"> </w:t>
-      </w:r>
-      <w:proofErr w:type="spellStart"/>
-      <w:r>
-        <w:t>се</w:t>
-      </w:r>
-      <w:proofErr w:type="spellEnd"/>
-      <w:r>
-        <w:t xml:space="preserve"> в </w:t>
-      </w:r>
-      <w:proofErr w:type="spellStart"/>
-      <w:r>
-        <w:t>северната</w:t>
-      </w:r>
-      <w:proofErr w:type="spellEnd"/>
-      <w:r>
-        <w:t xml:space="preserve"> </w:t>
-      </w:r>
-      <w:proofErr w:type="spellStart"/>
-      <w:r>
-        <w:t>част</w:t>
-      </w:r>
-      <w:proofErr w:type="spellEnd"/>
-      <w:r>
-        <w:t xml:space="preserve"> </w:t>
-      </w:r>
-      <w:proofErr w:type="spellStart"/>
-      <w:r>
-        <w:t>на</w:t>
-      </w:r>
-      <w:proofErr w:type="spellEnd"/>
-      <w:r>
-        <w:t xml:space="preserve"> </w:t>
-      </w:r>
-      <w:proofErr w:type="spellStart"/>
-      <w:r>
-        <w:t>планината</w:t>
-      </w:r>
-      <w:proofErr w:type="spellEnd"/>
-      <w:r>
-        <w:t xml:space="preserve">, </w:t>
-      </w:r>
-      <w:proofErr w:type="spellStart"/>
-      <w:r>
-        <w:t>издигайки</w:t>
-      </w:r>
-      <w:proofErr w:type="spellEnd"/>
-      <w:r>
-        <w:t xml:space="preserve"> </w:t>
-      </w:r>
-      <w:proofErr w:type="spellStart"/>
-      <w:r>
-        <w:t>се</w:t>
-      </w:r>
-      <w:proofErr w:type="spellEnd"/>
-      <w:r>
-        <w:t xml:space="preserve"> </w:t>
-      </w:r>
-      <w:proofErr w:type="spellStart"/>
-      <w:r>
-        <w:t>над</w:t>
-      </w:r>
-      <w:proofErr w:type="spellEnd"/>
-      <w:r>
-        <w:t xml:space="preserve"> </w:t>
-      </w:r>
-      <w:proofErr w:type="spellStart"/>
-      <w:r>
-        <w:t>Попово</w:t>
-      </w:r>
-      <w:proofErr w:type="spellEnd"/>
-      <w:r>
-        <w:t xml:space="preserve"> </w:t>
-      </w:r>
-      <w:proofErr w:type="spellStart"/>
-      <w:r>
-        <w:t>езеро</w:t>
-      </w:r>
-      <w:proofErr w:type="spellEnd"/>
-      <w:r>
-        <w:t xml:space="preserve"> и </w:t>
-      </w:r>
-      <w:proofErr w:type="spellStart"/>
-      <w:r>
-        <w:t>циркуса</w:t>
-      </w:r>
-      <w:proofErr w:type="spellEnd"/>
-      <w:r>
-        <w:t xml:space="preserve"> </w:t>
-      </w:r>
-      <w:proofErr w:type="spellStart"/>
-      <w:r>
-        <w:t>на</w:t>
-      </w:r>
-      <w:proofErr w:type="spellEnd"/>
-      <w:r>
-        <w:t xml:space="preserve"> </w:t>
-      </w:r>
-      <w:proofErr w:type="spellStart"/>
-      <w:r>
-        <w:t>Десилица</w:t>
-      </w:r>
-      <w:proofErr w:type="spellEnd"/>
-      <w:r>
-        <w:t>.</w:t>
-      </w:r>
-    </w:p>
-    <w:p>
-      <w:pPr>
-        <w:pStyle w:val="NormalWeb"/>
-      </w:pPr>
-      <w:proofErr w:type="spellStart"/>
-      <w:r>
-        <w:t>Характеризира</w:t>
-      </w:r>
-      <w:proofErr w:type="spellEnd"/>
-      <w:r>
-        <w:t xml:space="preserve"> </w:t>
-      </w:r>
-      <w:proofErr w:type="spellStart"/>
-      <w:r>
-        <w:t>се</w:t>
-      </w:r>
-      <w:proofErr w:type="spellEnd"/>
-      <w:r>
-        <w:t xml:space="preserve"> с </w:t>
-      </w:r>
-      <w:proofErr w:type="spellStart"/>
-      <w:r>
-        <w:t>широки</w:t>
-      </w:r>
-      <w:proofErr w:type="spellEnd"/>
-      <w:r>
-        <w:t xml:space="preserve">, </w:t>
-      </w:r>
-      <w:proofErr w:type="spellStart"/>
-      <w:r>
-        <w:t>сравнително</w:t>
-      </w:r>
-      <w:proofErr w:type="spellEnd"/>
-      <w:r>
-        <w:t xml:space="preserve"> </w:t>
-      </w:r>
-      <w:proofErr w:type="spellStart"/>
-      <w:r>
-        <w:t>полегати</w:t>
-      </w:r>
-      <w:proofErr w:type="spellEnd"/>
-      <w:r>
-        <w:t xml:space="preserve"> </w:t>
-      </w:r>
-      <w:proofErr w:type="spellStart"/>
-      <w:r>
-        <w:t>склонове</w:t>
-      </w:r>
-      <w:proofErr w:type="spellEnd"/>
-      <w:r>
-        <w:t xml:space="preserve"> (</w:t>
-      </w:r>
-      <w:proofErr w:type="spellStart"/>
-      <w:r>
-        <w:t>откъдето</w:t>
-      </w:r>
-      <w:proofErr w:type="spellEnd"/>
-      <w:r>
-        <w:t xml:space="preserve"> </w:t>
-      </w:r>
-      <w:proofErr w:type="spellStart"/>
-      <w:r>
-        <w:t>идва</w:t>
-      </w:r>
-      <w:proofErr w:type="spellEnd"/>
-      <w:r>
-        <w:t xml:space="preserve"> и </w:t>
-      </w:r>
-      <w:proofErr w:type="spellStart"/>
-      <w:r>
-        <w:t>името</w:t>
-      </w:r>
-      <w:proofErr w:type="spellEnd"/>
-      <w:r>
-        <w:t xml:space="preserve"> </w:t>
-      </w:r>
-      <w:proofErr w:type="spellStart"/>
-      <w:r>
-        <w:t>му</w:t>
-      </w:r>
-      <w:proofErr w:type="spellEnd"/>
-      <w:r>
-        <w:t xml:space="preserve">), </w:t>
-      </w:r>
-      <w:proofErr w:type="spellStart"/>
-      <w:r>
-        <w:t>което</w:t>
-      </w:r>
-      <w:proofErr w:type="spellEnd"/>
-      <w:r>
-        <w:t xml:space="preserve"> </w:t>
-      </w:r>
-      <w:proofErr w:type="spellStart"/>
-      <w:r>
-        <w:t>го</w:t>
-      </w:r>
-      <w:proofErr w:type="spellEnd"/>
-      <w:r>
-        <w:t xml:space="preserve"> </w:t>
-      </w:r>
-      <w:proofErr w:type="spellStart"/>
-      <w:r>
-        <w:t>прави</w:t>
-      </w:r>
-      <w:proofErr w:type="spellEnd"/>
-      <w:r>
-        <w:t xml:space="preserve"> </w:t>
-      </w:r>
-      <w:proofErr w:type="spellStart"/>
-      <w:r>
-        <w:t>по-достъпен</w:t>
-      </w:r>
-      <w:proofErr w:type="spellEnd"/>
-      <w:r>
-        <w:t xml:space="preserve"> </w:t>
-      </w:r>
-      <w:proofErr w:type="spellStart"/>
-      <w:r>
-        <w:t>за</w:t>
-      </w:r>
-      <w:proofErr w:type="spellEnd"/>
-      <w:r>
-        <w:t xml:space="preserve"> </w:t>
-      </w:r>
-      <w:proofErr w:type="spellStart"/>
-      <w:r>
-        <w:t>изкачване</w:t>
-      </w:r>
-      <w:proofErr w:type="spellEnd"/>
-      <w:r>
-        <w:t xml:space="preserve"> в </w:t>
-      </w:r>
-      <w:proofErr w:type="spellStart"/>
-      <w:r>
-        <w:t>сравнение</w:t>
-      </w:r>
-      <w:proofErr w:type="spellEnd"/>
-      <w:r>
-        <w:t xml:space="preserve"> с </w:t>
-      </w:r>
-      <w:proofErr w:type="spellStart"/>
-      <w:r>
-        <w:t>Вихрен</w:t>
-      </w:r>
-      <w:proofErr w:type="spellEnd"/>
-      <w:r>
-        <w:t xml:space="preserve">. </w:t>
-      </w:r>
-      <w:proofErr w:type="spellStart"/>
-      <w:r>
-        <w:t>От</w:t>
-      </w:r>
-      <w:proofErr w:type="spellEnd"/>
-      <w:r>
-        <w:t xml:space="preserve"> </w:t>
-      </w:r>
-      <w:proofErr w:type="spellStart"/>
-      <w:r>
-        <w:t>върха</w:t>
-      </w:r>
-      <w:proofErr w:type="spellEnd"/>
-      <w:r>
-        <w:t xml:space="preserve"> </w:t>
-      </w:r>
-      <w:proofErr w:type="spellStart"/>
-      <w:r>
-        <w:t>се</w:t>
-      </w:r>
-      <w:proofErr w:type="spellEnd"/>
-      <w:r>
-        <w:t xml:space="preserve"> </w:t>
-      </w:r>
-      <w:proofErr w:type="spellStart"/>
-      <w:r>
-        <w:t>разкрива</w:t>
-      </w:r>
-      <w:proofErr w:type="spellEnd"/>
-      <w:r>
-        <w:t xml:space="preserve"> </w:t>
-      </w:r>
-      <w:proofErr w:type="spellStart"/>
-      <w:r>
-        <w:t>впечатляваща</w:t>
-      </w:r>
-      <w:proofErr w:type="spellEnd"/>
-      <w:r>
-        <w:t xml:space="preserve"> </w:t>
-      </w:r>
-      <w:proofErr w:type="spellStart"/>
-      <w:r>
-        <w:t>панорама</w:t>
-      </w:r>
-      <w:proofErr w:type="spellEnd"/>
-      <w:r>
-        <w:t xml:space="preserve"> </w:t>
-      </w:r>
-      <w:proofErr w:type="spellStart"/>
-      <w:r>
-        <w:t>към</w:t>
-      </w:r>
-      <w:proofErr w:type="spellEnd"/>
-      <w:r>
-        <w:t xml:space="preserve"> </w:t>
-      </w:r>
-      <w:proofErr w:type="spellStart"/>
-      <w:r>
-        <w:t>мраморния</w:t>
-      </w:r>
-      <w:proofErr w:type="spellEnd"/>
-      <w:r>
-        <w:t xml:space="preserve"> </w:t>
-      </w:r>
-      <w:proofErr w:type="spellStart"/>
-      <w:r>
-        <w:t>дял</w:t>
-      </w:r>
-      <w:proofErr w:type="spellEnd"/>
-      <w:r>
-        <w:t xml:space="preserve"> </w:t>
-      </w:r>
-      <w:proofErr w:type="spellStart"/>
-      <w:r>
-        <w:t>на</w:t>
-      </w:r>
-      <w:proofErr w:type="spellEnd"/>
-      <w:r>
-        <w:t xml:space="preserve"> </w:t>
-      </w:r>
-      <w:proofErr w:type="spellStart"/>
-      <w:r>
-        <w:t>Пирин</w:t>
-      </w:r>
-      <w:proofErr w:type="spellEnd"/>
-      <w:r>
-        <w:t xml:space="preserve">, </w:t>
-      </w:r>
-      <w:proofErr w:type="spellStart"/>
-      <w:r>
-        <w:t>Кончето</w:t>
-      </w:r>
-      <w:proofErr w:type="spellEnd"/>
-      <w:r>
-        <w:t xml:space="preserve"> и </w:t>
-      </w:r>
-      <w:proofErr w:type="spellStart"/>
-      <w:r>
-        <w:t>множество</w:t>
-      </w:r>
-      <w:proofErr w:type="spellEnd"/>
-      <w:r>
-        <w:t xml:space="preserve"> </w:t>
-      </w:r>
-      <w:proofErr w:type="spellStart"/>
-      <w:r>
-        <w:t>ледникови</w:t>
-      </w:r>
-      <w:proofErr w:type="spellEnd"/>
-      <w:r>
-        <w:t xml:space="preserve"> </w:t>
-      </w:r>
-      <w:proofErr w:type="spellStart"/>
-      <w:r>
-        <w:t>езера</w:t>
-      </w:r>
-      <w:proofErr w:type="spellEnd"/>
-      <w:r>
-        <w:t>.</w:t>
-      </w:r>
-    </w:p>
-    <w:p>
-      <w:pPr>
-        <w:pStyle w:val="NormalWeb"/>
-      </w:pPr>
-      <w:proofErr w:type="spellStart"/>
-      <w:r>
-        <w:t>Полежан</w:t>
-      </w:r>
-      <w:proofErr w:type="spellEnd"/>
-      <w:r>
-        <w:t xml:space="preserve"> е </w:t>
-      </w:r>
-      <w:proofErr w:type="spellStart"/>
-      <w:r>
-        <w:t>предпочитана</w:t>
-      </w:r>
-      <w:proofErr w:type="spellEnd"/>
-      <w:r>
-        <w:t xml:space="preserve"> </w:t>
-      </w:r>
-      <w:proofErr w:type="spellStart"/>
-      <w:r>
-        <w:t>цел</w:t>
-      </w:r>
-      <w:proofErr w:type="spellEnd"/>
-      <w:r>
-        <w:t xml:space="preserve"> </w:t>
-      </w:r>
-      <w:proofErr w:type="spellStart"/>
-      <w:r>
-        <w:t>както</w:t>
-      </w:r>
-      <w:proofErr w:type="spellEnd"/>
-      <w:r>
-        <w:t xml:space="preserve"> </w:t>
-      </w:r>
-      <w:proofErr w:type="spellStart"/>
-      <w:r>
-        <w:t>през</w:t>
-      </w:r>
-      <w:proofErr w:type="spellEnd"/>
-      <w:r>
-        <w:t xml:space="preserve"> </w:t>
-      </w:r>
-      <w:proofErr w:type="spellStart"/>
-      <w:r>
-        <w:t>лятото</w:t>
-      </w:r>
-      <w:proofErr w:type="spellEnd"/>
-      <w:r>
-        <w:t xml:space="preserve"> </w:t>
-      </w:r>
-      <w:proofErr w:type="spellStart"/>
-      <w:r>
-        <w:t>за</w:t>
-      </w:r>
-      <w:proofErr w:type="spellEnd"/>
-      <w:r>
-        <w:t xml:space="preserve"> </w:t>
-      </w:r>
-      <w:proofErr w:type="spellStart"/>
-      <w:r>
-        <w:t>планински</w:t>
-      </w:r>
-      <w:proofErr w:type="spellEnd"/>
-      <w:r>
-        <w:t xml:space="preserve"> </w:t>
-      </w:r>
-      <w:proofErr w:type="spellStart"/>
-      <w:r>
-        <w:t>туризъм</w:t>
-      </w:r>
-      <w:proofErr w:type="spellEnd"/>
-      <w:r>
-        <w:t xml:space="preserve">, </w:t>
-      </w:r>
-      <w:proofErr w:type="spellStart"/>
-      <w:r>
-        <w:t>така</w:t>
-      </w:r>
-      <w:proofErr w:type="spellEnd"/>
-      <w:r>
-        <w:t xml:space="preserve"> и </w:t>
-      </w:r>
-      <w:proofErr w:type="spellStart"/>
-      <w:r>
-        <w:t>през</w:t>
-      </w:r>
-      <w:proofErr w:type="spellEnd"/>
-      <w:r>
-        <w:t xml:space="preserve"> </w:t>
-      </w:r>
-      <w:proofErr w:type="spellStart"/>
-      <w:r>
-        <w:t>зимата</w:t>
-      </w:r>
-      <w:proofErr w:type="spellEnd"/>
-      <w:r>
-        <w:t xml:space="preserve"> </w:t>
-      </w:r>
-      <w:proofErr w:type="spellStart"/>
-      <w:r>
-        <w:t>за</w:t>
-      </w:r>
-      <w:proofErr w:type="spellEnd"/>
-      <w:r>
-        <w:t xml:space="preserve"> </w:t>
-      </w:r>
-      <w:proofErr w:type="spellStart"/>
-      <w:r>
-        <w:t>ски-алпинизъм</w:t>
-      </w:r>
-      <w:proofErr w:type="spellEnd"/>
-      <w:r>
-        <w:t>.</w:t>
-      </w:r>
-    </w:p>
-    <w:p>
-      <w:pPr>
-        <w:rPr>
-          <w:b/>
-          <w:bCs/>
-          <w:lang w:val="bg-BG"/>
-        </w:rPr>
-      </w:pPr>
-      <w:r>
-        <w:rPr>
-          <w:b/>
-          <w:bCs/>
-          <w:lang w:val="bg-BG"/>
-        </w:rPr>
-        <w:t xml:space="preserve">Сезон: </w:t>
-      </w:r>
-      <w:r>
-        <w:rPr>
-          <w:b/>
-          <w:bCs/>
-          <w:lang w:val="bg-BG"/>
-        </w:rPr>
-        <w:t>Сезон: 2024</w:t>
-      </w:r>
-    </w:p>
-    <w:p>
-      <w:pPr>
-        <w:rPr>
-          <w:b/>
-          <w:bCs/>
-        </w:rPr>
-      </w:pPr>
-      <w:r>
-        <w:rPr>
-          <w:b/>
-          <w:bCs/>
-          <w:lang w:val="bg-BG"/>
-        </w:rPr>
-        <w:t xml:space="preserve">Снимки: </w:t>
-      </w:r>
-      <w:r>
-        <w:rPr>
-          <w:b/>
-          <w:bCs/>
-        </w:rPr>
-        <w:t>Images\Polejan 17.08.2024</w:t>
-      </w:r>
-    </w:p>
-    <w:p>
-      <w:pPr>
-        <w:rPr>
-          <w:b/>
-          <w:bCs/>
-          <w:lang w:val="bg-BG"/>
-        </w:rPr>
-      </w:pPr>
-      <w:r>
-        <w:rPr>
-          <w:b/>
-          <w:bCs/>
-          <w:lang w:val="bg-BG"/>
-        </w:rPr>
-        <w:t>Намери координатите и ги добави автоматичн</w:t>
-      </w:r>
-      <w:r>
-        <w:rPr>
-          <w:b/>
-          <w:bCs/>
-          <w:lang w:val="bg-BG"/>
-        </w:rPr>
-        <w:t>о</w:t>
-      </w:r>
-    </w:p>
-    <w:p>
-      <w:pPr>
-        <w:rPr>
-          <w:b/>
-          <w:bCs/>
-        </w:rPr>
-      </w:pPr>
-      <w:r>
-        <w:rPr>
-          <w:b/>
-          <w:bCs/>
-        </w:rPr>
-        <w:t>Step 4</w:t>
-      </w:r>
-    </w:p>
-    <w:p>
-      <w:pPr>
-        <w:rPr>
-          <w:b/>
-          <w:bCs/>
-        </w:rPr>
-      </w:pPr>
-      <w:r>
-        <w:rPr>
-          <w:b/>
-          <w:bCs/>
-        </w:rPr>
-        <w:t xml:space="preserve">Implement user roles in </w:t>
-      </w:r>
-      <w:proofErr w:type="spellStart"/>
-      <w:r>
-        <w:rPr>
-          <w:b/>
-          <w:bCs/>
-        </w:rPr>
-        <w:t>Supabase</w:t>
-      </w:r>
-      <w:proofErr w:type="spellEnd"/>
-      <w:r>
-        <w:rPr>
-          <w:b/>
-          <w:bCs/>
-        </w:rPr>
-        <w:t>:</w:t>
-      </w:r>
-    </w:p>
-    <w:p>
-      <w:pPr>
-        <w:rPr>
-          <w:b/>
-          <w:bCs/>
-        </w:rPr>
-      </w:pPr>
-      <w:r>
-        <w:rPr>
-          <w:b/>
-          <w:bCs/>
-        </w:rPr>
-        <w:t xml:space="preserve">-Enum: </w:t>
-      </w:r>
-      <w:proofErr w:type="spellStart"/>
-      <w:r>
-        <w:rPr>
-          <w:b/>
-          <w:bCs/>
-        </w:rPr>
-        <w:t>app_role</w:t>
-      </w:r>
-      <w:proofErr w:type="spellEnd"/>
-      <w:r>
-        <w:rPr>
-          <w:b/>
-          <w:bCs/>
-        </w:rPr>
-        <w:t xml:space="preserve"> (</w:t>
-      </w:r>
-      <w:r>
-        <w:rPr>
-          <w:b/>
-          <w:bCs/>
-        </w:rPr>
-        <w:t>visitors</w:t>
-      </w:r>
-      <w:r>
-        <w:rPr>
-          <w:b/>
-          <w:bCs/>
-        </w:rPr>
-        <w:t xml:space="preserve"> | </w:t>
-      </w:r>
-      <w:r>
-        <w:rPr>
-          <w:b/>
-          <w:bCs/>
-        </w:rPr>
-        <w:t>publisher</w:t>
-      </w:r>
-      <w:r>
-        <w:rPr>
-          <w:b/>
-          <w:bCs/>
-        </w:rPr>
-        <w:t xml:space="preserve"> </w:t>
-      </w:r>
-      <w:r>
-        <w:rPr>
-          <w:b/>
-          <w:bCs/>
-        </w:rPr>
-        <w:t xml:space="preserve">| </w:t>
-      </w:r>
-      <w:r>
-        <w:rPr>
-          <w:b/>
-          <w:bCs/>
-        </w:rPr>
-        <w:t>editor</w:t>
-      </w:r>
-      <w:r>
-        <w:rPr>
-          <w:b/>
-          <w:bCs/>
-        </w:rPr>
-        <w:t xml:space="preserve"> </w:t>
-      </w:r>
-      <w:r>
-        <w:rPr>
-          <w:b/>
-          <w:bCs/>
-        </w:rPr>
-        <w:t>|</w:t>
-      </w:r>
-      <w:r>
-        <w:rPr>
-          <w:b/>
-          <w:bCs/>
-        </w:rPr>
-        <w:t>admin)</w:t>
-      </w:r>
-    </w:p>
-    <w:p>
-      <w:pPr>
-        <w:rPr>
-          <w:b/>
-          <w:bCs/>
-        </w:rPr>
-      </w:pPr>
-      <w:r>
-        <w:rPr>
-          <w:b/>
-          <w:bCs/>
-        </w:rPr>
-        <w:t>-</w:t>
-      </w:r>
-      <w:proofErr w:type="spellStart"/>
-      <w:r>
-        <w:rPr>
-          <w:b/>
-          <w:bCs/>
-        </w:rPr>
-        <w:t>Тable</w:t>
-      </w:r>
-      <w:proofErr w:type="spellEnd"/>
-      <w:r>
-        <w:rPr>
-          <w:b/>
-          <w:bCs/>
-        </w:rPr>
-        <w:t xml:space="preserve">: </w:t>
-      </w:r>
-      <w:proofErr w:type="spellStart"/>
       <w:r>
         <w:rPr>
           <w:b/>
@@ -1160,362 +758,6 @@
         </w:rPr>
         <w:t>user_roles</w:t>
       </w:r>
-      <w:proofErr w:type="spellEnd"/>
-      <w:r>
-        <w:rPr>
-          <w:b/>
-          <w:bCs/>
-        </w:rPr>
-        <w:t xml:space="preserve"> (</w:t>
-      </w:r>
-      <w:proofErr w:type="spellStart"/>
-      <w:r>
-        <w:rPr>
-          <w:b/>
-          <w:bCs/>
-        </w:rPr>
-        <w:t>user_id</w:t>
-      </w:r>
-      <w:proofErr w:type="spellEnd"/>
-      <w:r>
-        <w:rPr>
-          <w:b/>
-          <w:bCs/>
-        </w:rPr>
-        <w:t xml:space="preserve">, </w:t>
-      </w:r>
-      <w:proofErr w:type="spellStart"/>
-      <w:r>
-        <w:rPr>
-          <w:b/>
-          <w:bCs/>
-        </w:rPr>
-        <w:t>user_role</w:t>
-      </w:r>
-      <w:proofErr w:type="spellEnd"/>
-      <w:r>
-        <w:rPr>
-          <w:b/>
-          <w:bCs/>
-        </w:rPr>
-        <w:t>)</w:t>
-      </w:r>
-    </w:p>
-    <w:p>
-      <w:pPr>
-        <w:rPr>
-          <w:b/>
-          <w:bCs/>
-        </w:rPr>
-      </w:pPr>
-      <w:r>
-        <w:rPr>
-          <w:b/>
-          <w:bCs/>
-        </w:rPr>
-        <w:t>Define RLS policies:</w:t>
-      </w:r>
-    </w:p>
-    <w:p>
-      <w:pPr>
-        <w:rPr>
-          <w:b/>
-          <w:bCs/>
-        </w:rPr>
-      </w:pPr>
-      <w:r>
-        <w:rPr>
-          <w:b/>
-          <w:bCs/>
-        </w:rPr>
-        <w:t xml:space="preserve">-Everyone can read </w:t>
-      </w:r>
-      <w:proofErr w:type="spellStart"/>
-      <w:r>
-        <w:rPr>
-          <w:b/>
-          <w:bCs/>
-        </w:rPr>
-        <w:t>user_roles</w:t>
-      </w:r>
-      <w:proofErr w:type="spellEnd"/>
-    </w:p>
-    <w:p>
-      <w:pPr>
-        <w:rPr>
-          <w:b/>
-          <w:bCs/>
-        </w:rPr>
-      </w:pPr>
-      <w:r>
-        <w:rPr>
-          <w:b/>
-          <w:bCs/>
-        </w:rPr>
-        <w:t xml:space="preserve">-Database function </w:t>
-      </w:r>
-      <w:proofErr w:type="spellStart"/>
-      <w:r>
-        <w:rPr>
-          <w:b/>
-          <w:bCs/>
-        </w:rPr>
-        <w:t>is_</w:t>
-      </w:r>
-      <w:proofErr w:type="gramStart"/>
-      <w:r>
-        <w:rPr>
-          <w:b/>
-          <w:bCs/>
-        </w:rPr>
-        <w:t>admin</w:t>
-      </w:r>
-      <w:proofErr w:type="spellEnd"/>
-      <w:r>
-        <w:rPr>
-          <w:b/>
-          <w:bCs/>
-        </w:rPr>
-        <w:t>(</w:t>
-      </w:r>
-      <w:proofErr w:type="gramEnd"/>
-      <w:r>
-        <w:rPr>
-          <w:b/>
-          <w:bCs/>
-        </w:rPr>
-        <w:t>)</w:t>
-      </w:r>
-    </w:p>
-    <w:p>
-      <w:pPr>
-        <w:rPr>
-          <w:b/>
-          <w:bCs/>
-        </w:rPr>
-      </w:pPr>
-      <w:r>
-        <w:rPr>
-          <w:b/>
-          <w:bCs/>
-        </w:rPr>
-        <w:t xml:space="preserve">-Everyone </w:t>
-      </w:r>
-      <w:r>
-        <w:rPr>
-          <w:b/>
-          <w:bCs/>
-        </w:rPr>
-        <w:t xml:space="preserve">can </w:t>
-      </w:r>
-      <w:r>
-        <w:rPr>
-          <w:b/>
-          <w:bCs/>
-        </w:rPr>
-        <w:t xml:space="preserve">only </w:t>
-      </w:r>
-      <w:r>
-        <w:rPr>
-          <w:b/>
-          <w:bCs/>
-        </w:rPr>
-        <w:t>r</w:t>
-      </w:r>
-      <w:r>
-        <w:rPr>
-          <w:b/>
-          <w:bCs/>
-        </w:rPr>
-        <w:t>ead</w:t>
-      </w:r>
-      <w:r>
-        <w:rPr>
-          <w:b/>
-          <w:bCs/>
-        </w:rPr>
-        <w:t xml:space="preserve"> </w:t>
-      </w:r>
-      <w:r>
-        <w:rPr>
-          <w:b/>
-          <w:bCs/>
-        </w:rPr>
-        <w:t xml:space="preserve">location </w:t>
-      </w:r>
-      <w:r>
-        <w:rPr>
-          <w:b/>
-          <w:bCs/>
-        </w:rPr>
-        <w:t>information in app</w:t>
-      </w:r>
-    </w:p>
-    <w:p>
-      <w:pPr>
-        <w:rPr>
-          <w:b/>
-          <w:bCs/>
-        </w:rPr>
-      </w:pPr>
-      <w:r>
-        <w:rPr>
-          <w:b/>
-          <w:bCs/>
-        </w:rPr>
-        <w:t>-</w:t>
-      </w:r>
-      <w:r>
-        <w:rPr>
-          <w:b/>
-          <w:bCs/>
-        </w:rPr>
-        <w:t>Publisher</w:t>
-      </w:r>
-      <w:r>
-        <w:rPr>
-          <w:b/>
-          <w:bCs/>
-        </w:rPr>
-        <w:t xml:space="preserve"> can rea</w:t>
-      </w:r>
-      <w:r>
-        <w:rPr>
-          <w:b/>
-          <w:bCs/>
-        </w:rPr>
-        <w:t xml:space="preserve">d </w:t>
-      </w:r>
-      <w:r>
-        <w:rPr>
-          <w:b/>
-          <w:bCs/>
-        </w:rPr>
-        <w:t>information in app</w:t>
-      </w:r>
-      <w:r>
-        <w:rPr>
-          <w:b/>
-          <w:bCs/>
-        </w:rPr>
-        <w:t xml:space="preserve"> and change only location </w:t>
-      </w:r>
-      <w:r>
-        <w:rPr>
-          <w:b/>
-          <w:bCs/>
-        </w:rPr>
-        <w:t>that is own</w:t>
-      </w:r>
-    </w:p>
-    <w:p>
-      <w:pPr>
-        <w:rPr>
-          <w:b/>
-          <w:bCs/>
-        </w:rPr>
-      </w:pPr>
-      <w:r>
-        <w:rPr>
-          <w:b/>
-          <w:bCs/>
-        </w:rPr>
-        <w:t>-</w:t>
-      </w:r>
-      <w:r>
-        <w:rPr>
-          <w:b/>
-          <w:bCs/>
-        </w:rPr>
-        <w:t xml:space="preserve"> </w:t>
-      </w:r>
-      <w:r>
-        <w:rPr>
-          <w:b/>
-          <w:bCs/>
-        </w:rPr>
-        <w:t xml:space="preserve">Editor can read </w:t>
-      </w:r>
-      <w:r>
-        <w:rPr>
-          <w:b/>
-          <w:bCs/>
-        </w:rPr>
-        <w:t>everting</w:t>
-      </w:r>
-      <w:r>
-        <w:rPr>
-          <w:b/>
-          <w:bCs/>
-        </w:rPr>
-        <w:t xml:space="preserve"> and edit </w:t>
-      </w:r>
-      <w:r>
-        <w:rPr>
-          <w:b/>
-          <w:bCs/>
-        </w:rPr>
-        <w:t xml:space="preserve">everything information in the </w:t>
-      </w:r>
-      <w:r>
-        <w:rPr>
-          <w:b/>
-          <w:bCs/>
-        </w:rPr>
-        <w:t>location</w:t>
-      </w:r>
-      <w:r>
-        <w:rPr>
-          <w:b/>
-          <w:bCs/>
-        </w:rPr>
-        <w:t xml:space="preserve"> </w:t>
-      </w:r>
-    </w:p>
-    <w:p>
-      <w:pPr>
-        <w:rPr>
-          <w:b/>
-          <w:bCs/>
-        </w:rPr>
-      </w:pPr>
-      <w:r>
-        <w:rPr>
-          <w:b/>
-          <w:bCs/>
-        </w:rPr>
-        <w:t>-Only admins</w:t>
-      </w:r>
-      <w:r>
-        <w:rPr>
-          <w:b/>
-          <w:bCs/>
-        </w:rPr>
-        <w:t xml:space="preserve"> </w:t>
-      </w:r>
-      <w:r>
-        <w:rPr>
-          <w:b/>
-          <w:bCs/>
-        </w:rPr>
-        <w:t>can write</w:t>
-      </w:r>
-      <w:r>
-        <w:rPr>
-          <w:b/>
-          <w:bCs/>
-        </w:rPr>
-        <w:t xml:space="preserve"> </w:t>
-      </w:r>
-      <w:proofErr w:type="spellStart"/>
-      <w:r>
-        <w:rPr>
-          <w:b/>
-          <w:bCs/>
-        </w:rPr>
-        <w:t>user_roles</w:t>
-      </w:r>
-      <w:proofErr w:type="spellEnd"/>
     </w:p>
     <w:p>
       <w:pPr>
@@ -1889,7 +1131,28 @@
           <w:b/>
           <w:bCs/>
         </w:rPr>
-        <w:t>multi</w:t>
+        <w:t xml:space="preserve">Change stile in </w:t>
+      </w:r>
+      <w:r>
+        <w:rPr>
+          <w:b/>
+          <w:bCs/>
+        </w:rPr>
+        <w:t>mobile</w:t>
+      </w:r>
+      <w:r>
+        <w:rPr>
+          <w:b/>
+          <w:bCs/>
+        </w:rPr>
+        <w:t xml:space="preserve"> and </w:t>
+      </w:r>
+      <w:r>
+        <w:rPr>
+          <w:b/>
+          <w:bCs/>
+        </w:rPr>
+        <w:t>desktop</w:t>
       </w:r>
       <w:r>
         <w:rPr>
@@ -1903,67 +1166,37 @@
           <w:b/>
           <w:bCs/>
         </w:rPr>
+        <w:t>version</w:t>
+      </w:r>
+      <w:r>
+        <w:rPr>
+          <w:b/>
+          <w:bCs/>
+        </w:rPr>
+        <w:t>app</w:t>
+      </w:r>
+    </w:p>
+    <w:p>
+      <w:pPr>
+        <w:rPr>
+          <w:b/>
+          <w:bCs/>
+        </w:rPr>
+      </w:pPr>
+      <w:r>
+        <w:rPr>
+          <w:b/>
+          <w:bCs/>
+        </w:rPr>
+        <w:t>Newly registered users can log in automatically after registration, but I want the administrator to approve them before users can publish their locations. This is by security reasons</w:t>
+      </w:r>
+      <w:r>
+        <w:rPr>
+          <w:b/>
+          <w:bCs/>
+        </w:rPr>
         <w:t xml:space="preserve"> </w:t>
       </w:r>
-      <w:r>
-        <w:rPr>
-          <w:b/>
-          <w:bCs/>
-        </w:rPr>
-        <w:t xml:space="preserve"> chose</w:t>
-      </w:r>
-    </w:p>
-    <w:p>
-      <w:pPr>
-        <w:rPr>
-          <w:b/>
-          <w:bCs/>
-        </w:rPr>
-      </w:pPr>
-      <w:r>
-        <w:rPr>
-          <w:b/>
-          <w:bCs/>
-        </w:rPr>
-        <w:t>Emoji</w:t>
-      </w:r>
-      <w:r>
-        <w:rPr>
-          <w:b/>
-          <w:bCs/>
-        </w:rPr>
-        <w:t xml:space="preserve"> </w:t>
-      </w:r>
-    </w:p>
-    <w:p>
-      <w:pPr>
-        <w:rPr>
-          <w:b/>
-          <w:bCs/>
-        </w:rPr>
-      </w:pPr>
-    </w:p>
-    <w:p>
-      <w:pPr>
-        <w:rPr>
-          <w:b/>
-          <w:bCs/>
-        </w:rPr>
-      </w:pPr>
-      <w:r>
-        <w:rPr>
-          <w:b/>
-          <w:bCs/>
-        </w:rPr>
-        <w:t>Newly registered users can log in automatically after registration, but I want the administrator to approve them before users can publish their locations. This is by security reasons</w:t>
-      </w:r>
-      <w:r>
-        <w:rPr>
-          <w:b/>
-          <w:bCs/>
-        </w:rPr>
-        <w:t xml:space="preserve"> </w:t>
-      </w:r>
     </w:p>
     <w:p>
       <w:pPr>
@@ -2031,97 +1264,7 @@
           <w:bCs/>
           <w:lang w:val="bg-BG"/>
         </w:rPr>
-        <w:t xml:space="preserve">Искаш ли да добавя и кратък </w:t>
-      </w:r>
-      <w:proofErr w:type="spellStart"/>
-      <w:r>
-        <w:rPr>
-          <w:b/>
-          <w:bCs/>
-          <w:lang w:val="bg-BG"/>
-        </w:rPr>
-        <w:t>success</w:t>
-      </w:r>
-      <w:proofErr w:type="spellEnd"/>
-      <w:r>
-        <w:rPr>
-          <w:b/>
-          <w:bCs/>
-          <w:lang w:val="bg-BG"/>
-        </w:rPr>
-        <w:t>/</w:t>
-      </w:r>
-      <w:proofErr w:type="spellStart"/>
-      <w:r>
-        <w:rPr>
-          <w:b/>
-          <w:bCs/>
-          <w:lang w:val="bg-BG"/>
-        </w:rPr>
-        <w:t>error</w:t>
-      </w:r>
-      <w:proofErr w:type="spellEnd"/>
-      <w:r>
-        <w:rPr>
-          <w:b/>
-          <w:bCs/>
-          <w:lang w:val="bg-BG"/>
-        </w:rPr>
-        <w:t xml:space="preserve"> </w:t>
-      </w:r>
-      <w:proofErr w:type="spellStart"/>
-      <w:r>
-        <w:rPr>
-          <w:b/>
-          <w:bCs/>
-          <w:lang w:val="bg-BG"/>
-        </w:rPr>
-        <w:t>toast</w:t>
-      </w:r>
-      <w:proofErr w:type="spellEnd"/>
-      <w:r>
-        <w:rPr>
-          <w:b/>
-          <w:bCs/>
-          <w:lang w:val="bg-BG"/>
-        </w:rPr>
-        <w:t xml:space="preserve"> UI в </w:t>
-      </w:r>
-      <w:proofErr w:type="spellStart"/>
-      <w:r>
-        <w:rPr>
-          <w:b/>
-          <w:bCs/>
-          <w:lang w:val="bg-BG"/>
-        </w:rPr>
-        <w:t>admin</w:t>
-      </w:r>
-      <w:proofErr w:type="spellEnd"/>
-      <w:r>
-        <w:rPr>
-          <w:b/>
-          <w:bCs/>
-          <w:lang w:val="bg-BG"/>
-        </w:rPr>
-        <w:t xml:space="preserve"> панела вместо </w:t>
-      </w:r>
-      <w:proofErr w:type="spellStart"/>
-      <w:r>
-        <w:rPr>
-          <w:b/>
-          <w:bCs/>
-          <w:lang w:val="bg-BG"/>
-        </w:rPr>
-        <w:t>alert</w:t>
-      </w:r>
-      <w:proofErr w:type="spellEnd"/>
-      <w:r>
-        <w:rPr>
-          <w:b/>
-          <w:bCs/>
-          <w:lang w:val="bg-BG"/>
-        </w:rPr>
-        <w:t xml:space="preserve"> съобщения?</w:t>
+        <w:t>Искаш ли да добавя и кратък success/error toast UI в admin панела вместо alert съобщения?</w:t>
       </w:r>
     </w:p>
     <w:p>
@@ -2154,43 +1297,7 @@
           <w:bCs/>
           <w:lang w:val="bg-BG"/>
         </w:rPr>
-        <w:t xml:space="preserve"> на нова локация да се прави автоматично папка в </w:t>
-      </w:r>
-      <w:proofErr w:type="spellStart"/>
-      <w:r>
-        <w:rPr>
-          <w:b/>
-          <w:bCs/>
-          <w:lang w:val="bg-BG"/>
-        </w:rPr>
-        <w:t>buckets</w:t>
-      </w:r>
-      <w:proofErr w:type="spellEnd"/>
-      <w:r>
-        <w:rPr>
-          <w:b/>
-          <w:bCs/>
-          <w:lang w:val="bg-BG"/>
-        </w:rPr>
-        <w:t xml:space="preserve"> </w:t>
-      </w:r>
-      <w:proofErr w:type="spellStart"/>
-      <w:r>
-        <w:rPr>
-          <w:b/>
-          <w:bCs/>
-          <w:lang w:val="bg-BG"/>
-        </w:rPr>
-        <w:t>public</w:t>
-      </w:r>
-      <w:proofErr w:type="spellEnd"/>
-      <w:r>
-        <w:rPr>
-          <w:b/>
-          <w:bCs/>
-          <w:lang w:val="bg-BG"/>
-        </w:rPr>
-        <w:t xml:space="preserve"> като наименованието на папката да е името на локацията на латинеца плюс д</w:t>
+        <w:t xml:space="preserve"> на нова локация да се прави автоматично папка в buckets public като наименованието на папката да е името на локацията на латинеца плюс д</w:t>
       </w:r>
       <w:r>
         <w:rPr>
@@ -2206,61 +1313,7 @@
           <w:bCs/>
           <w:lang w:val="bg-BG"/>
         </w:rPr>
-        <w:t>тата на събитието в подобен формат "</w:t>
-      </w:r>
-      <w:proofErr w:type="spellStart"/>
-      <w:r>
-        <w:rPr>
-          <w:b/>
-          <w:bCs/>
-          <w:lang w:val="bg-BG"/>
-        </w:rPr>
-        <w:t>location</w:t>
-      </w:r>
-      <w:proofErr w:type="spellEnd"/>
-      <w:r>
-        <w:rPr>
-          <w:b/>
-          <w:bCs/>
-          <w:lang w:val="bg-BG"/>
-        </w:rPr>
-        <w:t xml:space="preserve"> </w:t>
-      </w:r>
-      <w:proofErr w:type="spellStart"/>
-      <w:r>
-        <w:rPr>
-          <w:b/>
-          <w:bCs/>
-          <w:lang w:val="bg-BG"/>
-        </w:rPr>
-        <w:t>dd.mm.yyyy</w:t>
-      </w:r>
-      <w:proofErr w:type="spellEnd"/>
-      <w:r>
-        <w:rPr>
-          <w:b/>
-          <w:bCs/>
-          <w:lang w:val="bg-BG"/>
-        </w:rPr>
-        <w:t xml:space="preserve">" като за </w:t>
-      </w:r>
-      <w:proofErr w:type="spellStart"/>
-      <w:r>
-        <w:rPr>
-          <w:b/>
-          <w:bCs/>
-          <w:lang w:val="bg-BG"/>
-        </w:rPr>
-        <w:t>location</w:t>
-      </w:r>
-      <w:proofErr w:type="spellEnd"/>
-      <w:r>
-        <w:rPr>
-          <w:b/>
-          <w:bCs/>
-          <w:lang w:val="bg-BG"/>
-        </w:rPr>
-        <w:t xml:space="preserve"> вземаш името на локацията на латинеца започващо с главна буква а датата ще вземаш от полето за дата.</w:t>
+        <w:t>тата на събитието в подобен формат "location dd.mm.yyyy" като за location вземаш името на локацията на латинеца започващо с главна буква а датата ще вземаш от полето за дата.</w:t>
       </w:r>
     </w:p>
     <w:p>

</xml_diff>

<commit_message>
Add hero subtitle and enhance styles for better visibility on mobile and desktop
</commit_message>
<xml_diff>
--- a/PrompsMap.docx
+++ b/PrompsMap.docx
@@ -48,15 +48,7 @@
         <w:t xml:space="preserve">-When insert location user should be possibility to add short information about locations and add pictures if hi want. </w:t>
       </w:r>
       <w:r>
-        <w:t xml:space="preserve">This </w:t>
-      </w:r>
-      <w:proofErr w:type="gramStart"/>
-      <w:r>
-        <w:t>mean</w:t>
-      </w:r>
-      <w:proofErr w:type="gramEnd"/>
-      <w:r>
-        <w:t xml:space="preserve"> to create necessary buckets</w:t>
+        <w:t>This mean to create necessary buckets</w:t>
       </w:r>
     </w:p>
     <w:p>
@@ -84,15 +76,7 @@
     </w:p>
     <w:p>
       <w:r>
-        <w:t xml:space="preserve">-Define RLS policies to protect </w:t>
-      </w:r>
-      <w:proofErr w:type="gramStart"/>
-      <w:r>
-        <w:t>users</w:t>
-      </w:r>
-      <w:proofErr w:type="gramEnd"/>
-      <w:r>
-        <w:t xml:space="preserve"> data</w:t>
+        <w:t>-Define RLS policies to protect users data</w:t>
       </w:r>
     </w:p>
     <w:p>
@@ -1260,31 +1244,15 @@
           <w:b/>
           <w:bCs/>
         </w:rPr>
-        <w:t>is_</w:t>
-      </w:r>
-      <w:proofErr w:type="gramStart"/>
-      <w:r>
-        <w:rPr>
-          <w:b/>
-          <w:bCs/>
-        </w:rPr>
-        <w:t>admin</w:t>
-      </w:r>
-      <w:proofErr w:type="spellEnd"/>
-      <w:r>
-        <w:rPr>
-          <w:b/>
-          <w:bCs/>
-        </w:rPr>
-        <w:t>(</w:t>
-      </w:r>
-      <w:proofErr w:type="gramEnd"/>
-      <w:r>
-        <w:rPr>
-          <w:b/>
-          <w:bCs/>
-        </w:rPr>
-        <w:t>)</w:t>
+        <w:t>is_admin</w:t>
+      </w:r>
+      <w:proofErr w:type="spellEnd"/>
+      <w:r>
+        <w:rPr>
+          <w:b/>
+          <w:bCs/>
+        </w:rPr>
+        <w:t>()</w:t>
       </w:r>
     </w:p>
     <w:p>
@@ -1876,6 +1844,22 @@
           <w:lang w:val="bg-BG"/>
         </w:rPr>
       </w:pPr>
+      <w:r>
+        <w:rPr>
+          <w:b/>
+          <w:bCs/>
+          <w:lang w:val="bg-BG"/>
+        </w:rPr>
+        <w:t>В мобилната версия "на планина.." го смъкни още малко на долу</w:t>
+      </w:r>
+      <w:r>
+        <w:rPr>
+          <w:b/>
+          <w:bCs/>
+          <w:lang w:val="bg-BG"/>
+        </w:rPr>
+        <w:t xml:space="preserve"> </w:t>
+      </w:r>
     </w:p>
     <w:p>
       <w:pPr>

</xml_diff>

<commit_message>
Implement location ordering by visit date and enhance mobile search visibility
</commit_message>
<xml_diff>
--- a/PrompsMap.docx
+++ b/PrompsMap.docx
@@ -1841,88 +1841,68 @@
         <w:rPr>
           <w:b/>
           <w:bCs/>
-          <w:lang w:val="bg-BG"/>
-        </w:rPr>
-      </w:pPr>
-      <w:r>
-        <w:rPr>
-          <w:b/>
-          <w:bCs/>
-          <w:lang w:val="bg-BG"/>
-        </w:rPr>
-        <w:t>В мобилната версия "на планина.." го смъкни още малко на долу</w:t>
-      </w:r>
-      <w:r>
-        <w:rPr>
-          <w:b/>
-          <w:bCs/>
-          <w:lang w:val="bg-BG"/>
-        </w:rPr>
-        <w:t xml:space="preserve"> </w:t>
-      </w:r>
-    </w:p>
-    <w:p>
-      <w:pPr>
-        <w:rPr>
-          <w:b/>
-          <w:bCs/>
-        </w:rPr>
-      </w:pPr>
-      <w:r>
-        <w:rPr>
-          <w:b/>
-          <w:bCs/>
-        </w:rPr>
-        <w:t xml:space="preserve">Change stile in </w:t>
-      </w:r>
-      <w:r>
-        <w:rPr>
-          <w:b/>
-          <w:bCs/>
-        </w:rPr>
-        <w:t>mobile</w:t>
-      </w:r>
-      <w:r>
-        <w:rPr>
-          <w:b/>
-          <w:bCs/>
-        </w:rPr>
-        <w:t xml:space="preserve"> and </w:t>
-      </w:r>
-      <w:r>
-        <w:rPr>
-          <w:b/>
-          <w:bCs/>
-        </w:rPr>
-        <w:t>desktop</w:t>
-      </w:r>
-      <w:r>
-        <w:rPr>
-          <w:b/>
-          <w:bCs/>
-        </w:rPr>
-        <w:t xml:space="preserve"> </w:t>
-      </w:r>
-      <w:r>
-        <w:rPr>
-          <w:b/>
-          <w:bCs/>
-        </w:rPr>
-        <w:t>version</w:t>
-      </w:r>
-      <w:r>
-        <w:rPr>
-          <w:b/>
-          <w:bCs/>
-        </w:rPr>
-        <w:t xml:space="preserve"> in </w:t>
-      </w:r>
-      <w:r>
-        <w:rPr>
-          <w:b/>
-          <w:bCs/>
-        </w:rPr>
-        <w:t>app</w:t>
+        </w:rPr>
+      </w:pPr>
+      <w:r>
+        <w:rPr>
+          <w:b/>
+          <w:bCs/>
+        </w:rPr>
+        <w:t xml:space="preserve">reorder location via date was they was </w:t>
+      </w:r>
+      <w:r>
+        <w:rPr>
+          <w:b/>
+          <w:bCs/>
+        </w:rPr>
+        <w:t>happened</w:t>
+      </w:r>
+    </w:p>
+    <w:p>
+      <w:pPr>
+        <w:rPr>
+          <w:b/>
+          <w:bCs/>
+        </w:rPr>
+      </w:pPr>
+      <w:r>
+        <w:rPr>
+          <w:b/>
+          <w:bCs/>
+        </w:rPr>
+        <w:t xml:space="preserve"> </w:t>
+      </w:r>
+      <w:proofErr w:type="spellStart"/>
+      <w:r>
+        <w:rPr>
+          <w:b/>
+          <w:bCs/>
+        </w:rPr>
+        <w:t>hen</w:t>
+      </w:r>
+      <w:proofErr w:type="spellEnd"/>
+      <w:r>
+        <w:rPr>
+          <w:b/>
+          <w:bCs/>
+        </w:rPr>
+        <w:t xml:space="preserve"> the popup in the location loaded hide the search menu </w:t>
+      </w:r>
+      <w:proofErr w:type="spellStart"/>
+      <w:r>
+        <w:rPr>
+          <w:b/>
+          <w:bCs/>
+        </w:rPr>
+        <w:t>whye</w:t>
+      </w:r>
+      <w:proofErr w:type="spellEnd"/>
+      <w:r>
+        <w:rPr>
+          <w:b/>
+          <w:bCs/>
+        </w:rPr>
+        <w:t xml:space="preserve"> is appear on the map on mobile version in app</w:t>
       </w:r>
     </w:p>
     <w:p>

</xml_diff>

<commit_message>
Hide mobile zoom controls and search menu when location popup is open
</commit_message>
<xml_diff>
--- a/PrompsMap.docx
+++ b/PrompsMap.docx
@@ -48,7 +48,15 @@
         <w:t xml:space="preserve">-When insert location user should be possibility to add short information about locations and add pictures if hi want. </w:t>
       </w:r>
       <w:r>
-        <w:t>This mean to create necessary buckets</w:t>
+        <w:t xml:space="preserve">This </w:t>
+      </w:r>
+      <w:proofErr w:type="gramStart"/>
+      <w:r>
+        <w:t>mean</w:t>
+      </w:r>
+      <w:proofErr w:type="gramEnd"/>
+      <w:r>
+        <w:t xml:space="preserve"> to create necessary buckets</w:t>
       </w:r>
     </w:p>
     <w:p>
@@ -76,7 +84,15 @@
     </w:p>
     <w:p>
       <w:r>
-        <w:t>-Define RLS policies to protect users data</w:t>
+        <w:t xml:space="preserve">-Define RLS policies to protect </w:t>
+      </w:r>
+      <w:proofErr w:type="gramStart"/>
+      <w:r>
+        <w:t>users</w:t>
+      </w:r>
+      <w:proofErr w:type="gramEnd"/>
+      <w:r>
+        <w:t xml:space="preserve"> data</w:t>
       </w:r>
     </w:p>
     <w:p>
@@ -1244,15 +1260,31 @@
           <w:b/>
           <w:bCs/>
         </w:rPr>
-        <w:t>is_admin</w:t>
-      </w:r>
-      <w:proofErr w:type="spellEnd"/>
-      <w:r>
-        <w:rPr>
-          <w:b/>
-          <w:bCs/>
-        </w:rPr>
-        <w:t>()</w:t>
+        <w:t>is_</w:t>
+      </w:r>
+      <w:proofErr w:type="gramStart"/>
+      <w:r>
+        <w:rPr>
+          <w:b/>
+          <w:bCs/>
+        </w:rPr>
+        <w:t>admin</w:t>
+      </w:r>
+      <w:proofErr w:type="spellEnd"/>
+      <w:r>
+        <w:rPr>
+          <w:b/>
+          <w:bCs/>
+        </w:rPr>
+        <w:t>(</w:t>
+      </w:r>
+      <w:proofErr w:type="gramEnd"/>
+      <w:r>
+        <w:rPr>
+          <w:b/>
+          <w:bCs/>
+        </w:rPr>
+        <w:t>)</w:t>
       </w:r>
     </w:p>
     <w:p>
@@ -1872,37 +1904,64 @@
         </w:rPr>
         <w:t xml:space="preserve"> </w:t>
       </w:r>
-      <w:proofErr w:type="spellStart"/>
-      <w:r>
-        <w:rPr>
-          <w:b/>
-          <w:bCs/>
-        </w:rPr>
-        <w:t>hen</w:t>
-      </w:r>
-      <w:proofErr w:type="spellEnd"/>
-      <w:r>
-        <w:rPr>
-          <w:b/>
-          <w:bCs/>
-        </w:rPr>
-        <w:t xml:space="preserve"> the popup in the location loaded hide the search menu </w:t>
-      </w:r>
-      <w:proofErr w:type="spellStart"/>
-      <w:r>
-        <w:rPr>
-          <w:b/>
-          <w:bCs/>
-        </w:rPr>
-        <w:t>whye</w:t>
-      </w:r>
-      <w:proofErr w:type="spellEnd"/>
+      <w:r>
+        <w:rPr>
+          <w:b/>
+          <w:bCs/>
+        </w:rPr>
+        <w:t>W</w:t>
+      </w:r>
+      <w:r>
+        <w:rPr>
+          <w:b/>
+          <w:bCs/>
+        </w:rPr>
+        <w:t xml:space="preserve">hen the popup in the location loaded hide the search menu </w:t>
+      </w:r>
+      <w:r>
+        <w:rPr>
+          <w:b/>
+          <w:bCs/>
+        </w:rPr>
+        <w:t>whys</w:t>
+      </w:r>
       <w:r>
         <w:rPr>
           <w:b/>
           <w:bCs/>
         </w:rPr>
         <w:t xml:space="preserve"> is appear on the map on mobile version in app</w:t>
+      </w:r>
+    </w:p>
+    <w:p>
+      <w:pPr>
+        <w:rPr>
+          <w:b/>
+          <w:bCs/>
+        </w:rPr>
+      </w:pPr>
+      <w:r>
+        <w:rPr>
+          <w:b/>
+          <w:bCs/>
+        </w:rPr>
+        <w:t xml:space="preserve">Hide </w:t>
+      </w:r>
+      <w:proofErr w:type="gramStart"/>
+      <w:r>
+        <w:rPr>
+          <w:b/>
+          <w:bCs/>
+        </w:rPr>
+        <w:t>too</w:t>
+      </w:r>
+      <w:proofErr w:type="gramEnd"/>
+      <w:r>
+        <w:rPr>
+          <w:b/>
+          <w:bCs/>
+        </w:rPr>
+        <w:t xml:space="preserve"> zoom in and zoom out menu on the map section when is popup is loaded</w:t>
       </w:r>
     </w:p>
     <w:p>

</xml_diff>

<commit_message>
Add admin approval button for user registration and enhance UI with fade effect
</commit_message>
<xml_diff>
--- a/PrompsMap.docx
+++ b/PrompsMap.docx
@@ -48,15 +48,7 @@
         <w:t xml:space="preserve">-When insert location user should be possibility to add short information about locations and add pictures if hi want. </w:t>
       </w:r>
       <w:r>
-        <w:t xml:space="preserve">This </w:t>
-      </w:r>
-      <w:proofErr w:type="gramStart"/>
-      <w:r>
-        <w:t>mean</w:t>
-      </w:r>
-      <w:proofErr w:type="gramEnd"/>
-      <w:r>
-        <w:t xml:space="preserve"> to create necessary buckets</w:t>
+        <w:t>This mean to create necessary buckets</w:t>
       </w:r>
     </w:p>
     <w:p>
@@ -84,15 +76,7 @@
     </w:p>
     <w:p>
       <w:r>
-        <w:t xml:space="preserve">-Define RLS policies to protect </w:t>
-      </w:r>
-      <w:proofErr w:type="gramStart"/>
-      <w:r>
-        <w:t>users</w:t>
-      </w:r>
-      <w:proofErr w:type="gramEnd"/>
-      <w:r>
-        <w:t xml:space="preserve"> data</w:t>
+        <w:t>-Define RLS policies to protect users data</w:t>
       </w:r>
     </w:p>
     <w:p>
@@ -1260,31 +1244,15 @@
           <w:b/>
           <w:bCs/>
         </w:rPr>
-        <w:t>is_</w:t>
-      </w:r>
-      <w:proofErr w:type="gramStart"/>
-      <w:r>
-        <w:rPr>
-          <w:b/>
-          <w:bCs/>
-        </w:rPr>
-        <w:t>admin</w:t>
-      </w:r>
-      <w:proofErr w:type="spellEnd"/>
-      <w:r>
-        <w:rPr>
-          <w:b/>
-          <w:bCs/>
-        </w:rPr>
-        <w:t>(</w:t>
-      </w:r>
-      <w:proofErr w:type="gramEnd"/>
-      <w:r>
-        <w:rPr>
-          <w:b/>
-          <w:bCs/>
-        </w:rPr>
-        <w:t>)</w:t>
+        <w:t>is_admin</w:t>
+      </w:r>
+      <w:proofErr w:type="spellEnd"/>
+      <w:r>
+        <w:rPr>
+          <w:b/>
+          <w:bCs/>
+        </w:rPr>
+        <w:t>()</w:t>
       </w:r>
     </w:p>
     <w:p>
@@ -1945,23 +1913,7 @@
           <w:b/>
           <w:bCs/>
         </w:rPr>
-        <w:t xml:space="preserve">Hide </w:t>
-      </w:r>
-      <w:proofErr w:type="gramStart"/>
-      <w:r>
-        <w:rPr>
-          <w:b/>
-          <w:bCs/>
-        </w:rPr>
-        <w:t>too</w:t>
-      </w:r>
-      <w:proofErr w:type="gramEnd"/>
-      <w:r>
-        <w:rPr>
-          <w:b/>
-          <w:bCs/>
-        </w:rPr>
-        <w:t xml:space="preserve"> zoom in and zoom out menu on the map section when is popup is loaded</w:t>
+        <w:t>Hide too zoom in and zoom out menu on the map section when is popup is loaded</w:t>
       </w:r>
     </w:p>
     <w:p>
@@ -2037,6 +1989,22 @@
           <w:bCs/>
         </w:rPr>
       </w:pPr>
+      <w:r>
+        <w:rPr>
+          <w:b/>
+          <w:bCs/>
+          <w:lang w:val="bg-BG"/>
+        </w:rPr>
+        <w:t>баир будали</w:t>
+      </w:r>
+      <w:r>
+        <w:rPr>
+          <w:b/>
+          <w:bCs/>
+          <w:lang w:val="bg-BG"/>
+        </w:rPr>
+        <w:t xml:space="preserve"> </w:t>
+      </w:r>
     </w:p>
     <w:p>
       <w:pPr>
@@ -2289,9 +2257,36 @@
         <w:rPr>
           <w:b/>
           <w:bCs/>
-          <w:lang w:val="bg-BG"/>
-        </w:rPr>
-      </w:pPr>
+        </w:rPr>
+      </w:pPr>
+      <w:r>
+        <w:rPr>
+          <w:b/>
+          <w:bCs/>
+        </w:rPr>
+        <w:t>S</w:t>
+      </w:r>
+      <w:r>
+        <w:rPr>
+          <w:b/>
+          <w:bCs/>
+        </w:rPr>
+        <w:t>ecurity</w:t>
+      </w:r>
+      <w:r>
+        <w:rPr>
+          <w:b/>
+          <w:bCs/>
+        </w:rPr>
+        <w:t xml:space="preserve"> </w:t>
+      </w:r>
+      <w:r>
+        <w:rPr>
+          <w:b/>
+          <w:bCs/>
+        </w:rPr>
+        <w:t xml:space="preserve">responsible </w:t>
+      </w:r>
     </w:p>
     <w:p>
       <w:pPr>

</xml_diff>

<commit_message>
Update page title to reflect the dance club theme and clarify location reordering instructions
</commit_message>
<xml_diff>
--- a/PrompsMap.docx
+++ b/PrompsMap.docx
@@ -1833,8 +1833,31 @@
         <w:rPr>
           <w:b/>
           <w:bCs/>
-        </w:rPr>
-      </w:pPr>
+          <w:lang w:val="bg-BG"/>
+        </w:rPr>
+      </w:pPr>
+      <w:r>
+        <w:rPr>
+          <w:b/>
+          <w:bCs/>
+        </w:rPr>
+        <w:t>D</w:t>
+      </w:r>
+      <w:r>
+        <w:rPr>
+          <w:b/>
+          <w:bCs/>
+        </w:rPr>
+        <w:t>igital</w:t>
+      </w:r>
+      <w:r>
+        <w:rPr>
+          <w:b/>
+          <w:bCs/>
+          <w:lang w:val="bg-BG"/>
+        </w:rPr>
+        <w:t xml:space="preserve"> </w:t>
+      </w:r>
     </w:p>
     <w:p>
       <w:pPr>
@@ -2257,6 +2280,7 @@
         <w:rPr>
           <w:b/>
           <w:bCs/>
+          <w:lang w:val="bg-BG"/>
         </w:rPr>
       </w:pPr>
       <w:r>

</xml_diff>